<commit_message>
Improve voice template typography and spacing
</commit_message>
<xml_diff>
--- a/templates/納保申請書_官方格式_可套填_voice_1150811.docx
+++ b/templates/納保申請書_官方格式_可套填_voice_1150811.docx
@@ -1554,18 +1554,21 @@
           </w:tcPr>
           <w:p>
             <w:pPr>
-              <w:pStyle w:val="Normal"/>
-              <w:widowControl/>
-              <w:suppressAutoHyphens w:val="true"/>
-              <w:spacing w:lineRule="exact" w:line="240"/>
-              <w:rPr>
-                <w:rFonts w:ascii="標楷體;DFKai-SB" w:hAnsi="標楷體;DFKai-SB" w:eastAsia="標楷體;DFKai-SB" w:cs="標楷體;DFKai-SB"/>
-                <w:color w:val="000000"/>
-                <w:kern w:val="0"/>
-              </w:rPr>
-            </w:pPr>
-            <w:r>
-              <w:rPr>
+              <w:jc w:val="center"/>
+              <w:pStyle w:val="Normal"/>
+              <w:widowControl/>
+              <w:suppressAutoHyphens w:val="true"/>
+              <w:spacing w:lineRule="atLeast" w:line="300" w:before="0" w:after="0"/>
+              <w:rPr>
+                <w:rFonts w:ascii="標楷體;DFKai-SB" w:hAnsi="標楷體;DFKai-SB" w:eastAsia="標楷體;DFKai-SB" w:cs="標楷體;DFKai-SB"/>
+                <w:color w:val="000000"/>
+                <w:kern w:val="0"/>
+              </w:rPr>
+            </w:pPr>
+            <w:r>
+              <w:rPr>
+                <w:szCs w:val="26"/>
+                <w:sz w:val="26"/>
                 <w:rFonts w:ascii="標楷體;DFKai-SB" w:hAnsi="標楷體;DFKai-SB" w:cs="標楷體;DFKai-SB" w:eastAsia="標楷體;DFKai-SB"/>
                 <w:color w:val="000000"/>
                 <w:kern w:val="0"/>
@@ -1574,6 +1577,8 @@
             </w:r>
             <w:r>
               <w:rPr>
+                <w:szCs w:val="26"/>
+                <w:sz w:val="26"/>
                 <w:rFonts w:ascii="標楷體;DFKai-SB" w:hAnsi="標楷體;DFKai-SB" w:cs="標楷體;DFKai-SB" w:hint="eastAsia" w:eastAsia="標楷體;DFKai-SB"/>
                 <w:color w:val="000000"/>
                 <w:kern w:val="0"/>
@@ -1582,6 +1587,8 @@
             </w:r>
             <w:r>
               <w:rPr>
+                <w:szCs w:val="26"/>
+                <w:sz w:val="26"/>
                 <w:rFonts w:ascii="標楷體;DFKai-SB" w:hAnsi="標楷體;DFKai-SB" w:cs="標楷體;DFKai-SB" w:eastAsia="標楷體;DFKai-SB"/>
                 <w:color w:val="000000"/>
                 <w:kern w:val="0"/>
@@ -1590,6 +1597,8 @@
             </w:r>
             <w:r>
               <w:rPr>
+                <w:szCs w:val="26"/>
+                <w:sz w:val="26"/>
                 <w:rFonts w:ascii="標楷體;DFKai-SB" w:hAnsi="標楷體;DFKai-SB" w:cs="標楷體;DFKai-SB" w:hint="eastAsia" w:eastAsia="標楷體;DFKai-SB"/>
                 <w:color w:val="000000"/>
                 <w:kern w:val="0"/>
@@ -1598,6 +1607,8 @@
             </w:r>
             <w:r>
               <w:rPr>
+                <w:szCs w:val="26"/>
+                <w:sz w:val="26"/>
                 <w:rFonts w:ascii="標楷體;DFKai-SB" w:hAnsi="標楷體;DFKai-SB" w:cs="標楷體;DFKai-SB" w:eastAsia="標楷體;DFKai-SB"/>
                 <w:color w:val="000000"/>
                 <w:kern w:val="0"/>
@@ -1606,6 +1617,8 @@
             </w:r>
             <w:r>
               <w:rPr>
+                <w:szCs w:val="26"/>
+                <w:sz w:val="26"/>
                 <w:rFonts w:ascii="標楷體;DFKai-SB" w:hAnsi="標楷體;DFKai-SB" w:cs="標楷體;DFKai-SB" w:hint="eastAsia" w:eastAsia="標楷體;DFKai-SB"/>
                 <w:color w:val="000000"/>
                 <w:kern w:val="0"/>
@@ -1700,14 +1713,17 @@
           </w:tcPr>
           <w:p>
             <w:pPr>
-              <w:pStyle w:val="Normal"/>
-              <w:widowControl/>
-              <w:suppressAutoHyphens w:val="true"/>
-              <w:spacing w:lineRule="exact" w:line="240"/>
+              <w:jc w:val="center"/>
+              <w:pStyle w:val="Normal"/>
+              <w:widowControl/>
+              <w:suppressAutoHyphens w:val="true"/>
+              <w:spacing w:lineRule="atLeast" w:line="300" w:before="0" w:after="0"/>
               <w:rPr/>
             </w:pPr>
             <w:r>
               <w:rPr>
+                <w:szCs w:val="26"/>
+                <w:sz w:val="26"/>
                 <w:rFonts w:ascii="標楷體;DFKai-SB" w:hAnsi="標楷體;DFKai-SB" w:cs="標楷體;DFKai-SB" w:eastAsia="標楷體;DFKai-SB"/>
                 <w:color w:val="000000"/>
                 <w:kern w:val="0"/>
@@ -1716,6 +1732,8 @@
             </w:r>
             <w:r>
               <w:rPr>
+                <w:szCs w:val="26"/>
+                <w:sz w:val="26"/>
                 <w:rFonts w:ascii="標楷體;DFKai-SB" w:hAnsi="標楷體;DFKai-SB" w:cs="標楷體;DFKai-SB" w:hint="eastAsia" w:eastAsia="標楷體;DFKai-SB"/>
                 <w:color w:val="000000"/>
                 <w:kern w:val="0"/>
@@ -1724,6 +1742,8 @@
             </w:r>
             <w:r>
               <w:rPr>
+                <w:szCs w:val="26"/>
+                <w:sz w:val="26"/>
                 <w:rFonts w:ascii="標楷體;DFKai-SB" w:hAnsi="標楷體;DFKai-SB" w:cs="標楷體;DFKai-SB" w:eastAsia="標楷體;DFKai-SB"/>
                 <w:color w:val="000000"/>
                 <w:kern w:val="0"/>
@@ -1732,6 +1752,8 @@
             </w:r>
             <w:r>
               <w:rPr>
+                <w:szCs w:val="26"/>
+                <w:sz w:val="26"/>
                 <w:rFonts w:ascii="標楷體;DFKai-SB" w:hAnsi="標楷體;DFKai-SB" w:cs="標楷體;DFKai-SB" w:hint="eastAsia" w:eastAsia="標楷體;DFKai-SB"/>
                 <w:color w:val="000000"/>
                 <w:kern w:val="0"/>
@@ -1740,6 +1762,8 @@
             </w:r>
             <w:r>
               <w:rPr>
+                <w:szCs w:val="26"/>
+                <w:sz w:val="26"/>
                 <w:rFonts w:ascii="標楷體;DFKai-SB" w:hAnsi="標楷體;DFKai-SB" w:cs="標楷體;DFKai-SB" w:eastAsia="標楷體;DFKai-SB"/>
                 <w:color w:val="000000"/>
                 <w:kern w:val="0"/>
@@ -1834,18 +1858,21 @@
           </w:tcPr>
           <w:p>
             <w:pPr>
-              <w:pStyle w:val="Normal"/>
-              <w:widowControl/>
-              <w:suppressAutoHyphens w:val="true"/>
-              <w:spacing w:lineRule="exact" w:line="320" w:before="72" w:after="0"/>
-              <w:rPr>
-                <w:rFonts w:ascii="標楷體;DFKai-SB" w:hAnsi="標楷體;DFKai-SB" w:eastAsia="標楷體;DFKai-SB" w:cs="標楷體;DFKai-SB"/>
-                <w:color w:val="000000"/>
-                <w:kern w:val="0"/>
-              </w:rPr>
-            </w:pPr>
-            <w:r>
-              <w:rPr>
+              <w:jc w:val="center"/>
+              <w:pStyle w:val="Normal"/>
+              <w:widowControl/>
+              <w:suppressAutoHyphens w:val="true"/>
+              <w:spacing w:lineRule="atLeast" w:line="300" w:before="0" w:after="0"/>
+              <w:rPr>
+                <w:rFonts w:ascii="標楷體;DFKai-SB" w:hAnsi="標楷體;DFKai-SB" w:eastAsia="標楷體;DFKai-SB" w:cs="標楷體;DFKai-SB"/>
+                <w:color w:val="000000"/>
+                <w:kern w:val="0"/>
+              </w:rPr>
+            </w:pPr>
+            <w:r>
+              <w:rPr>
+                <w:szCs w:val="26"/>
+                <w:sz w:val="26"/>
                 <w:rFonts w:ascii="標楷體;DFKai-SB" w:hAnsi="標楷體;DFKai-SB" w:cs="標楷體;DFKai-SB" w:eastAsia="標楷體;DFKai-SB"/>
                 <w:color w:val="000000"/>
                 <w:kern w:val="0"/>
@@ -1854,6 +1881,8 @@
             </w:r>
             <w:r>
               <w:rPr>
+                <w:szCs w:val="26"/>
+                <w:sz w:val="26"/>
                 <w:rFonts w:ascii="標楷體;DFKai-SB" w:hAnsi="標楷體;DFKai-SB" w:cs="標楷體;DFKai-SB" w:hint="eastAsia" w:eastAsia="標楷體;DFKai-SB"/>
                 <w:color w:val="000000"/>
                 <w:kern w:val="0"/>
@@ -1862,6 +1891,8 @@
             </w:r>
             <w:r>
               <w:rPr>
+                <w:szCs w:val="26"/>
+                <w:sz w:val="26"/>
                 <w:rFonts w:eastAsia="標楷體;DFKai-SB" w:cs="標楷體;DFKai-SB" w:hint="eastAsia" w:ascii="標楷體;DFKai-SB" w:hAnsi="標楷體;DFKai-SB"/>
                 <w:color w:val="000000"/>
                 <w:kern w:val="0"/>
@@ -1870,6 +1901,8 @@
             </w:r>
             <w:r>
               <w:rPr>
+                <w:szCs w:val="26"/>
+                <w:sz w:val="26"/>
                 <w:rFonts w:ascii="標楷體;DFKai-SB" w:hAnsi="標楷體;DFKai-SB" w:cs="標楷體;DFKai-SB" w:hint="eastAsia" w:eastAsia="標楷體;DFKai-SB"/>
                 <w:color w:val="000000"/>
                 <w:kern w:val="0"/>
@@ -1878,6 +1911,8 @@
             </w:r>
             <w:r>
               <w:rPr>
+                <w:szCs w:val="26"/>
+                <w:sz w:val="26"/>
                 <w:rFonts w:eastAsia="標楷體;DFKai-SB" w:cs="標楷體;DFKai-SB" w:hint="eastAsia" w:ascii="標楷體;DFKai-SB" w:hAnsi="標楷體;DFKai-SB"/>
                 <w:color w:val="000000"/>
                 <w:kern w:val="0"/>
@@ -1887,10 +1922,11 @@
           </w:p>
           <w:p>
             <w:pPr>
-              <w:pStyle w:val="Normal"/>
-              <w:widowControl/>
-              <w:suppressAutoHyphens w:val="true"/>
-              <w:spacing w:lineRule="exact" w:line="280"/>
+              <w:jc w:val="both"/>
+              <w:pStyle w:val="Normal"/>
+              <w:widowControl/>
+              <w:suppressAutoHyphens w:val="true"/>
+              <w:spacing w:lineRule="auto" w:line="300" w:before="0" w:after="0"/>
               <w:rPr>
                 <w:rFonts w:ascii="標楷體;DFKai-SB" w:hAnsi="標楷體;DFKai-SB" w:eastAsia="標楷體;DFKai-SB" w:cs="標楷體;DFKai-SB" w:hint="eastAsia"/>
                 <w:color w:val="000000"/>
@@ -1900,54 +1936,60 @@
             </w:pPr>
             <w:r>
               <w:rPr>
-                <w:rFonts w:ascii="標楷體;DFKai-SB" w:hAnsi="標楷體;DFKai-SB" w:cs="標楷體;DFKai-SB" w:hint="eastAsia" w:eastAsia="標楷體;DFKai-SB"/>
-                <w:color w:val="000000"/>
-                <w:spacing w:val="-6"/>
+                <w:szCs w:val="24"/>
+                <w:sz w:val="24"/>
+                <w:rFonts w:ascii="標楷體;DFKai-SB" w:hAnsi="標楷體;DFKai-SB" w:cs="標楷體;DFKai-SB" w:hint="eastAsia" w:eastAsia="標楷體;DFKai-SB"/>
+                <w:color w:val="000000"/>
                 <w:kern w:val="0"/>
               </w:rPr>
               <w:t>※</w:t>
             </w:r>
             <w:r>
               <w:rPr>
-                <w:rFonts w:ascii="標楷體;DFKai-SB" w:hAnsi="標楷體;DFKai-SB" w:cs="標楷體;DFKai-SB" w:hint="eastAsia" w:eastAsia="標楷體;DFKai-SB"/>
-                <w:color w:val="000000"/>
-                <w:spacing w:val="-6"/>
+                <w:szCs w:val="24"/>
+                <w:sz w:val="24"/>
+                <w:rFonts w:ascii="標楷體;DFKai-SB" w:hAnsi="標楷體;DFKai-SB" w:cs="標楷體;DFKai-SB" w:hint="eastAsia" w:eastAsia="標楷體;DFKai-SB"/>
+                <w:color w:val="000000"/>
                 <w:kern w:val="0"/>
               </w:rPr>
               <w:t>至本處官網</w:t>
             </w:r>
             <w:r>
               <w:rPr>
+                <w:szCs w:val="24"/>
+                <w:sz w:val="24"/>
                 <w:rFonts w:eastAsia="標楷體;DFKai-SB" w:cs="標楷體;DFKai-SB" w:hint="eastAsia" w:ascii="標楷體;DFKai-SB" w:hAnsi="標楷體;DFKai-SB"/>
                 <w:color w:val="000000"/>
-                <w:spacing w:val="-6"/>
                 <w:kern w:val="0"/>
               </w:rPr>
               <w:t>/</w:t>
             </w:r>
             <w:r>
               <w:rPr>
-                <w:rFonts w:ascii="標楷體;DFKai-SB" w:hAnsi="標楷體;DFKai-SB" w:cs="標楷體;DFKai-SB" w:hint="eastAsia" w:eastAsia="標楷體;DFKai-SB"/>
-                <w:color w:val="000000"/>
-                <w:spacing w:val="-6"/>
+                <w:szCs w:val="24"/>
+                <w:sz w:val="24"/>
+                <w:rFonts w:ascii="標楷體;DFKai-SB" w:hAnsi="標楷體;DFKai-SB" w:cs="標楷體;DFKai-SB" w:hint="eastAsia" w:eastAsia="標楷體;DFKai-SB"/>
+                <w:color w:val="000000"/>
                 <w:kern w:val="0"/>
               </w:rPr>
               <w:t>線上稅務</w:t>
             </w:r>
             <w:r>
               <w:rPr>
+                <w:szCs w:val="24"/>
+                <w:sz w:val="24"/>
                 <w:rFonts w:eastAsia="標楷體;DFKai-SB" w:cs="標楷體;DFKai-SB" w:hint="eastAsia" w:ascii="標楷體;DFKai-SB" w:hAnsi="標楷體;DFKai-SB"/>
                 <w:color w:val="000000"/>
-                <w:spacing w:val="-6"/>
                 <w:kern w:val="0"/>
               </w:rPr>
               <w:t>/</w:t>
             </w:r>
             <w:r>
               <w:rPr>
-                <w:rFonts w:ascii="標楷體;DFKai-SB" w:hAnsi="標楷體;DFKai-SB" w:cs="標楷體;DFKai-SB" w:hint="eastAsia" w:eastAsia="標楷體;DFKai-SB"/>
-                <w:color w:val="000000"/>
-                <w:spacing w:val="-6"/>
+                <w:szCs w:val="24"/>
+                <w:sz w:val="24"/>
+                <w:rFonts w:ascii="標楷體;DFKai-SB" w:hAnsi="標楷體;DFKai-SB" w:cs="標楷體;DFKai-SB" w:hint="eastAsia" w:eastAsia="標楷體;DFKai-SB"/>
+                <w:color w:val="000000"/>
                 <w:kern w:val="0"/>
               </w:rPr>
               <w:t>案件進度查詢，可輸入身分證及手機末四碼查詢案件進度。</w:t>
@@ -2072,12 +2114,14 @@
               <w:pStyle w:val="Normal"/>
               <w:widowControl/>
               <w:suppressAutoHyphens w:val="true"/>
-              <w:spacing w:lineRule="exact" w:line="280"/>
-              <w:jc w:val="both"/>
+              <w:spacing w:lineRule="atLeast" w:line="300" w:before="0" w:after="0"/>
+              <w:jc w:val="center"/>
               <w:rPr/>
             </w:pPr>
             <w:r>
               <w:rPr>
+                <w:szCs w:val="26"/>
+                <w:sz w:val="26"/>
                 <w:rFonts w:ascii="標楷體;DFKai-SB" w:hAnsi="標楷體;DFKai-SB" w:cs="標楷體;DFKai-SB" w:eastAsia="標楷體;DFKai-SB"/>
                 <w:color w:val="000000"/>
                 <w:kern w:val="0"/>
@@ -2086,6 +2130,8 @@
             </w:r>
             <w:r>
               <w:rPr>
+                <w:szCs w:val="26"/>
+                <w:sz w:val="26"/>
                 <w:rFonts w:ascii="標楷體;DFKai-SB" w:hAnsi="標楷體;DFKai-SB" w:cs="標楷體;DFKai-SB" w:hint="eastAsia" w:eastAsia="標楷體;DFKai-SB"/>
                 <w:color w:val="000000"/>
                 <w:kern w:val="0"/>
@@ -2094,6 +2140,8 @@
             </w:r>
             <w:r>
               <w:rPr>
+                <w:szCs w:val="26"/>
+                <w:sz w:val="26"/>
                 <w:rFonts w:ascii="標楷體;DFKai-SB" w:hAnsi="標楷體;DFKai-SB" w:cs="標楷體;DFKai-SB" w:eastAsia="標楷體;DFKai-SB"/>
                 <w:color w:val="000000"/>
                 <w:kern w:val="0"/>
@@ -2102,6 +2150,8 @@
             </w:r>
             <w:r>
               <w:rPr>
+                <w:szCs w:val="26"/>
+                <w:sz w:val="26"/>
                 <w:rFonts w:ascii="標楷體;DFKai-SB" w:hAnsi="標楷體;DFKai-SB" w:cs="標楷體;DFKai-SB" w:hint="eastAsia" w:eastAsia="標楷體;DFKai-SB"/>
                 <w:color w:val="000000"/>
                 <w:kern w:val="0"/>
@@ -2110,6 +2160,8 @@
             </w:r>
             <w:r>
               <w:rPr>
+                <w:szCs w:val="26"/>
+                <w:sz w:val="26"/>
                 <w:rFonts w:ascii="標楷體;DFKai-SB" w:hAnsi="標楷體;DFKai-SB" w:cs="標楷體;DFKai-SB" w:eastAsia="標楷體;DFKai-SB"/>
                 <w:color w:val="000000"/>
                 <w:kern w:val="0"/>
@@ -2266,10 +2318,11 @@
           </w:tcPr>
           <w:p>
             <w:pPr>
-              <w:pStyle w:val="Normal"/>
-              <w:widowControl/>
-              <w:suppressAutoHyphens w:val="true"/>
-              <w:spacing w:lineRule="exact" w:line="280" w:before="0" w:after="57"/>
+              <w:jc w:val="center"/>
+              <w:pStyle w:val="Normal"/>
+              <w:widowControl/>
+              <w:suppressAutoHyphens w:val="true"/>
+              <w:spacing w:lineRule="atLeast" w:line="300" w:before="0" w:after="0"/>
               <w:rPr/>
             </w:pPr>
             <w:r>
@@ -2284,6 +2337,8 @@
             </w:r>
             <w:r>
               <w:rPr>
+                <w:szCs w:val="26"/>
+                <w:sz w:val="26"/>
                 <w:rFonts w:ascii="標楷體;DFKai-SB" w:hAnsi="標楷體;DFKai-SB" w:cs="標楷體;DFKai-SB" w:hint="eastAsia" w:eastAsia="標楷體;DFKai-SB"/>
                 <w:kern w:val="0"/>
               </w:rPr>
@@ -2291,6 +2346,8 @@
             </w:r>
             <w:r>
               <w:rPr>
+                <w:szCs w:val="26"/>
+                <w:sz w:val="26"/>
                 <w:rFonts w:ascii="標楷體;DFKai-SB" w:hAnsi="標楷體;DFKai-SB" w:cs="標楷體;DFKai-SB" w:eastAsia="標楷體;DFKai-SB"/>
                 <w:kern w:val="0"/>
               </w:rPr>
@@ -2298,6 +2355,8 @@
             </w:r>
             <w:r>
               <w:rPr>
+                <w:szCs w:val="26"/>
+                <w:sz w:val="26"/>
                 <w:rFonts w:ascii="標楷體;DFKai-SB" w:hAnsi="標楷體;DFKai-SB" w:cs="標楷體;DFKai-SB" w:hint="eastAsia" w:eastAsia="標楷體;DFKai-SB"/>
                 <w:kern w:val="0"/>
               </w:rPr>
@@ -2305,6 +2364,8 @@
             </w:r>
             <w:r>
               <w:rPr>
+                <w:szCs w:val="26"/>
+                <w:sz w:val="26"/>
                 <w:rFonts w:ascii="標楷體;DFKai-SB" w:hAnsi="標楷體;DFKai-SB" w:cs="標楷體;DFKai-SB" w:eastAsia="標楷體;DFKai-SB"/>
                 <w:color w:val="000000"/>
                 <w:kern w:val="0"/>
@@ -2313,6 +2374,8 @@
             </w:r>
             <w:r>
               <w:rPr>
+                <w:szCs w:val="26"/>
+                <w:sz w:val="26"/>
                 <w:rFonts w:ascii="標楷體;DFKai-SB" w:hAnsi="標楷體;DFKai-SB" w:cs="標楷體;DFKai-SB" w:hint="eastAsia" w:eastAsia="標楷體;DFKai-SB"/>
                 <w:kern w:val="0"/>
               </w:rPr>
@@ -2320,6 +2383,8 @@
             </w:r>
             <w:r>
               <w:rPr>
+                <w:szCs w:val="26"/>
+                <w:sz w:val="26"/>
                 <w:rFonts w:ascii="標楷體;DFKai-SB" w:hAnsi="標楷體;DFKai-SB" w:cs="標楷體;DFKai-SB" w:eastAsia="標楷體;DFKai-SB"/>
                 <w:kern w:val="0"/>
               </w:rPr>
@@ -2327,6 +2392,8 @@
             </w:r>
             <w:r>
               <w:rPr>
+                <w:szCs w:val="26"/>
+                <w:sz w:val="26"/>
                 <w:rFonts w:ascii="標楷體;DFKai-SB" w:hAnsi="標楷體;DFKai-SB" w:cs="標楷體;DFKai-SB" w:hint="eastAsia" w:eastAsia="標楷體;DFKai-SB"/>
                 <w:kern w:val="0"/>
               </w:rPr>
@@ -2334,6 +2401,8 @@
             </w:r>
             <w:r>
               <w:rPr>
+                <w:szCs w:val="26"/>
+                <w:sz w:val="26"/>
                 <w:rFonts w:ascii="標楷體;DFKai-SB" w:hAnsi="標楷體;DFKai-SB" w:cs="標楷體;DFKai-SB" w:eastAsia="標楷體;DFKai-SB"/>
                 <w:kern w:val="0"/>
               </w:rPr>
@@ -2351,6 +2420,8 @@
             </w:r>
             <w:r>
               <w:rPr>
+                <w:szCs w:val="26"/>
+                <w:sz w:val="26"/>
                 <w:rFonts w:ascii="標楷體;DFKai-SB" w:hAnsi="標楷體;DFKai-SB" w:cs="標楷體;DFKai-SB" w:hint="eastAsia" w:eastAsia="標楷體;DFKai-SB"/>
                 <w:kern w:val="0"/>
               </w:rPr>
@@ -2368,6 +2439,8 @@
             </w:r>
             <w:r>
               <w:rPr>
+                <w:szCs w:val="26"/>
+                <w:sz w:val="26"/>
                 <w:rFonts w:ascii="標楷體;DFKai-SB" w:hAnsi="標楷體;DFKai-SB" w:cs="標楷體;DFKai-SB" w:hint="eastAsia" w:eastAsia="標楷體;DFKai-SB"/>
                 <w:kern w:val="0"/>
               </w:rPr>
@@ -2375,6 +2448,8 @@
             </w:r>
             <w:r>
               <w:rPr>
+                <w:szCs w:val="26"/>
+                <w:sz w:val="26"/>
                 <w:rFonts w:ascii="標楷體;DFKai-SB" w:hAnsi="標楷體;DFKai-SB" w:cs="標楷體;DFKai-SB" w:eastAsia="標楷體;DFKai-SB"/>
                 <w:kern w:val="0"/>
               </w:rPr>
@@ -2382,6 +2457,8 @@
             </w:r>
             <w:r>
               <w:rPr>
+                <w:szCs w:val="26"/>
+                <w:sz w:val="26"/>
                 <w:rFonts w:ascii="標楷體;DFKai-SB" w:hAnsi="標楷體;DFKai-SB" w:cs="標楷體;DFKai-SB" w:hint="eastAsia" w:eastAsia="標楷體;DFKai-SB"/>
                 <w:kern w:val="0"/>
               </w:rPr>
@@ -2389,6 +2466,8 @@
             </w:r>
             <w:r>
               <w:rPr>
+                <w:szCs w:val="26"/>
+                <w:sz w:val="26"/>
                 <w:rFonts w:ascii="標楷體;DFKai-SB" w:hAnsi="標楷體;DFKai-SB" w:cs="標楷體;DFKai-SB" w:eastAsia="標楷體;DFKai-SB"/>
                 <w:kern w:val="0"/>
               </w:rPr>
@@ -2406,6 +2485,8 @@
             </w:r>
             <w:r>
               <w:rPr>
+                <w:szCs w:val="26"/>
+                <w:sz w:val="26"/>
                 <w:rFonts w:ascii="標楷體;DFKai-SB" w:hAnsi="標楷體;DFKai-SB" w:cs="標楷體;DFKai-SB" w:hint="eastAsia" w:eastAsia="標楷體;DFKai-SB"/>
                 <w:kern w:val="0"/>
               </w:rPr>
@@ -2413,6 +2494,8 @@
             </w:r>
             <w:r>
               <w:rPr>
+                <w:szCs w:val="26"/>
+                <w:sz w:val="26"/>
                 <w:rFonts w:ascii="標楷體;DFKai-SB" w:hAnsi="標楷體;DFKai-SB" w:cs="標楷體;DFKai-SB" w:eastAsia="標楷體;DFKai-SB"/>
                 <w:kern w:val="0"/>
               </w:rPr>
@@ -2420,6 +2503,8 @@
             </w:r>
             <w:r>
               <w:rPr>
+                <w:szCs w:val="26"/>
+                <w:sz w:val="26"/>
                 <w:rFonts w:ascii="標楷體;DFKai-SB" w:hAnsi="標楷體;DFKai-SB" w:cs="標楷體;DFKai-SB" w:hint="eastAsia" w:eastAsia="標楷體;DFKai-SB"/>
                 <w:kern w:val="0"/>
               </w:rPr>
@@ -2437,6 +2522,8 @@
             </w:r>
             <w:r>
               <w:rPr>
+                <w:szCs w:val="26"/>
+                <w:sz w:val="26"/>
                 <w:rFonts w:ascii="標楷體;DFKai-SB" w:hAnsi="標楷體;DFKai-SB" w:cs="標楷體;DFKai-SB" w:hint="eastAsia" w:eastAsia="標楷體;DFKai-SB"/>
                 <w:color w:val="000000"/>
                 <w:kern w:val="0"/>
@@ -2445,6 +2532,8 @@
             </w:r>
             <w:r>
               <w:rPr>
+                <w:szCs w:val="26"/>
+                <w:sz w:val="26"/>
                 <w:rFonts w:ascii="標楷體;DFKai-SB" w:hAnsi="標楷體;DFKai-SB" w:cs="標楷體;DFKai-SB" w:eastAsia="標楷體;DFKai-SB"/>
                 <w:color w:val="000000"/>
                 <w:kern w:val="0"/>
@@ -2562,13 +2651,14 @@
           </w:tcPr>
           <w:p>
             <w:pPr>
+              <w:jc w:val="both"/>
               <w:pStyle w:val="Normal"/>
               <w:widowControl/>
               <w:suppressAutoHyphens w:val="true"/>
               <w:kinsoku w:val="false"/>
               <w:autoSpaceDE w:val="false"/>
               <w:snapToGrid w:val="false"/>
-              <w:spacing w:lineRule="exact" w:line="320"/>
+              <w:spacing w:lineRule="auto" w:line="360" w:before="0" w:after="0"/>
               <w:rPr>
                 <w:rFonts w:ascii="標楷體;DFKai-SB" w:hAnsi="標楷體;DFKai-SB" w:eastAsia="標楷體;DFKai-SB" w:cs="標楷體;DFKai-SB" w:hint="eastAsia"/>
                 <w:color w:val="C00000"/>
@@ -2577,12 +2667,20 @@
             </w:pPr>
             <w:r>
               <w:rPr>
+                <w:szCs w:val="26"/>
+                <w:sz w:val="26"/>
                 <w:rFonts w:eastAsia="標楷體;DFKai-SB" w:cs="標楷體;DFKai-SB" w:hint="eastAsia" w:ascii="標楷體;DFKai-SB" w:hAnsi="標楷體;DFKai-SB"/>
                 <w:color w:val="C00000"/>
                 <w:kern w:val="0"/>
               </w:rPr>
             </w:r>
             <w:r>
+              <w:rPr>
+                <w:kern w:val="0"/>
+                <w:szCs w:val="26"/>
+                <w:sz w:val="26"/>
+                <w:rFonts w:ascii="標楷體;DFKai-SB" w:hAnsi="標楷體;DFKai-SB" w:cs="標楷體;DFKai-SB" w:eastAsia="標楷體;DFKai-SB"/>
+              </w:rPr>
               <w:t xml:space="preserve">{{formal_statement}}</w:t>
             </w:r>
           </w:p>
@@ -2662,25 +2760,34 @@
           </w:tcPr>
           <w:p>
             <w:pPr>
+              <w:jc w:val="both"/>
               <w:pStyle w:val="Normal"/>
               <w:widowControl/>
               <w:suppressAutoHyphens w:val="true"/>
               <w:snapToGrid w:val="false"/>
-              <w:spacing w:lineRule="exact" w:line="280"/>
-              <w:rPr>
-                <w:rFonts w:ascii="標楷體;DFKai-SB" w:hAnsi="標楷體;DFKai-SB" w:eastAsia="標楷體;DFKai-SB" w:cs="標楷體;DFKai-SB"/>
-                <w:color w:val="000000"/>
-                <w:kern w:val="0"/>
-              </w:rPr>
-            </w:pPr>
-            <w:r>
-              <w:rPr>
+              <w:spacing w:lineRule="atLeast" w:line="300" w:before="0" w:after="0"/>
+              <w:rPr>
+                <w:rFonts w:ascii="標楷體;DFKai-SB" w:hAnsi="標楷體;DFKai-SB" w:eastAsia="標楷體;DFKai-SB" w:cs="標楷體;DFKai-SB"/>
+                <w:color w:val="000000"/>
+                <w:kern w:val="0"/>
+              </w:rPr>
+            </w:pPr>
+            <w:r>
+              <w:rPr>
+                <w:szCs w:val="26"/>
+                <w:sz w:val="26"/>
                 <w:rFonts w:eastAsia="標楷體;DFKai-SB" w:cs="標楷體;DFKai-SB" w:ascii="標楷體;DFKai-SB" w:hAnsi="標楷體;DFKai-SB"/>
                 <w:color w:val="000000"/>
                 <w:kern w:val="0"/>
               </w:rPr>
             </w:r>
             <w:r>
+              <w:rPr>
+                <w:kern w:val="0"/>
+                <w:szCs w:val="26"/>
+                <w:sz w:val="26"/>
+                <w:rFonts w:ascii="標楷體;DFKai-SB" w:hAnsi="標楷體;DFKai-SB" w:cs="標楷體;DFKai-SB" w:eastAsia="標楷體;DFKai-SB"/>
+              </w:rPr>
               <w:t xml:space="preserve">{{evidence_list}}</w:t>
             </w:r>
           </w:p>

</xml_diff>